<commit_message>
feat: add 2017-2022 B2B industrial SEO experience and machinery scale projects
</commit_message>
<xml_diff>
--- a/Ho-So-Ung-Tuyen/CV-Graphic-UIUX-Designer-Le-Tran-Thanh-Uyen.docx
+++ b/Ho-So-Ung-Tuyen/CV-Graphic-UIUX-Designer-Le-Tran-Thanh-Uyen.docx
@@ -462,6 +462,75 @@
     </w:p>
     <w:p>
       <w:pPr>
+        <w:spacing w:before="160" w:after="40"/>
+      </w:pPr>
+      <w:r>
+        <w:rPr>
+          <w:rFonts w:ascii="Arial" w:hAnsi="Arial"/>
+          <w:b/>
+          <w:color w:val="0B2342"/>
+          <w:sz w:val="24"/>
+        </w:rPr>
+        <w:t>Industrial Graphic &amp; Spec Catalog Designer | Cụm Doanh Nghiệp Cơ Khí Thới An &amp; Cân Hoàng Thiên</w:t>
+      </w:r>
+      <w:r>
+        <w:rPr>
+          <w:rFonts w:ascii="Arial" w:hAnsi="Arial"/>
+          <w:i/>
+          <w:color w:val="4B5563"/>
+          <w:sz w:val="22"/>
+        </w:rPr>
+        <w:t xml:space="preserve">   (2017 – 2022)</w:t>
+      </w:r>
+    </w:p>
+    <w:p>
+      <w:pPr>
+        <w:pStyle w:val="ListBullet"/>
+        <w:spacing w:before="40" w:after="60" w:line="288" w:lineRule="auto"/>
+      </w:pPr>
+      <w:r>
+        <w:rPr>
+          <w:rFonts w:ascii="Arial" w:hAnsi="Arial"/>
+          <w:b/>
+          <w:color w:val="1F2937"/>
+          <w:sz w:val="22"/>
+        </w:rPr>
+        <w:t xml:space="preserve">Retouch ảnh máy móc &amp; công trình công nghiệp: </w:t>
+      </w:r>
+      <w:r>
+        <w:rPr>
+          <w:rFonts w:ascii="Arial" w:hAnsi="Arial"/>
+          <w:color w:val="1F2937"/>
+          <w:sz w:val="22"/>
+        </w:rPr>
+        <w:t>Trực tiếp chụp ảnh thực tế tại nhà xưởng, sử dụng Photoshop tách nền, khử tạp âm hình ảnh, xử lý ánh sáng và đổ bóng cho thiết bị cầu trục, pa lăng và trạm cân xe tải sắc nét.</w:t>
+      </w:r>
+    </w:p>
+    <w:p>
+      <w:pPr>
+        <w:pStyle w:val="ListBullet"/>
+        <w:spacing w:before="40" w:after="60" w:line="288" w:lineRule="auto"/>
+      </w:pPr>
+      <w:r>
+        <w:rPr>
+          <w:rFonts w:ascii="Arial" w:hAnsi="Arial"/>
+          <w:b/>
+          <w:color w:val="1F2937"/>
+          <w:sz w:val="22"/>
+        </w:rPr>
+        <w:t xml:space="preserve">Thiết kế Catalogue B2B &amp; Sơ đồ Kỹ thuật: </w:t>
+      </w:r>
+      <w:r>
+        <w:rPr>
+          <w:rFonts w:ascii="Arial" w:hAnsi="Arial"/>
+          <w:color w:val="1F2937"/>
+          <w:sz w:val="22"/>
+        </w:rPr>
+        <w:t>Sử dụng Illustrator vẽ sơ đồ cấu tạo cơ khí, bản vẽ kích thước dầm cầu trục, bảng thông số kỹ thuật (Spec Sheets) và profile công ty phục vụ nộp hồ sơ tham gia dự thầu.</w:t>
+      </w:r>
+    </w:p>
+    <w:p>
+      <w:pPr>
         <w:keepNext/>
         <w:spacing w:before="280" w:after="80"/>
         <w:pBdr>
@@ -475,7 +544,30 @@
           <w:color w:val="0B2342"/>
           <w:sz w:val="27"/>
         </w:rPr>
-        <w:t>■  MINH CHỨNG HIỆU QUẢ THIẾT KẾ QUA 6 DỰ ÁN THỰC TẾ (FEATURED PROJECTS)</w:t>
+        <w:t>■  MINH CHỨNG HIỆU QUẢ THIẾT KẾ QUA 7 DỰ ÁN THỰC TẾ (FEATURED PROJECTS)</w:t>
+      </w:r>
+    </w:p>
+    <w:p>
+      <w:pPr>
+        <w:pStyle w:val="ListBullet"/>
+        <w:spacing w:before="40" w:after="60" w:line="288" w:lineRule="auto"/>
+      </w:pPr>
+      <w:r>
+        <w:rPr>
+          <w:rFonts w:ascii="Arial" w:hAnsi="Arial"/>
+          <w:b/>
+          <w:color w:val="1F2937"/>
+          <w:sz w:val="22"/>
+        </w:rPr>
+        <w:t xml:space="preserve">Cầu Trục Thới An &amp; Cân Hoàng Thiên (cautructhoian.vn · hoangthienscale.com): </w:t>
+      </w:r>
+      <w:r>
+        <w:rPr>
+          <w:rFonts w:ascii="Arial" w:hAnsi="Arial"/>
+          <w:color w:val="1F2937"/>
+          <w:sz w:val="22"/>
+        </w:rPr>
+        <w:t>Xử lý hình ảnh thiết bị xưởng cơ khí, thi công cầu trục &amp; trạm cân xe tải bằng Photoshop; thiết kế trọn bộ catalogue thông số kỹ thuật B2B sắc nét bằng Illustrator (2017-2022).</w:t>
       </w:r>
     </w:p>
     <w:p>

</xml_diff>

<commit_message>
feat: clarify custom-coded WordPress theme for smartphone & sites, Flatsome for WangSun
</commit_message>
<xml_diff>
--- a/Ho-So-Ung-Tuyen/CV-Graphic-UIUX-Designer-Le-Tran-Thanh-Uyen.docx
+++ b/Ho-So-Ung-Tuyen/CV-Graphic-UIUX-Designer-Le-Tran-Thanh-Uyen.docx
@@ -590,7 +590,7 @@
           <w:color w:val="1F2937"/>
           <w:sz w:val="22"/>
         </w:rPr>
-        <w:t>Thiết kế phong cách thẩm mỹ viện hoàng gia, phối màu vàng kim &amp; xanh ngọc, retouching ảnh bác sĩ và khách hàng trước sau liệu trình sắc nét.</w:t>
+        <w:t>Thiết kế nhận diện phong cách thẩm mỹ viện hoàng gia, tùy biến giao diện Flatsome Child Theme, phối màu vàng kim &amp; xanh ngọc, retouching ảnh bác sĩ và khách hàng trước sau liệu trình sắc nét.</w:t>
       </w:r>
     </w:p>
     <w:p>
@@ -659,7 +659,7 @@
           <w:color w:val="1F2937"/>
           <w:sz w:val="22"/>
         </w:rPr>
-        <w:t>Thiết kế giao diện mua sắm điện thoại công nghệ hiện đại: phân cấp thông tin rõ ràng, thẻ sản phẩm tinh tế, bộ icon tính năng chi tiết chuẩn vector.</w:t>
+        <w:t>Thiết kế giao diện mua sắm điện thoại công nghệ hiện đại cho website WordPress tự code theme: phân cấp thông tin rõ ràng, thẻ sản phẩm tinh tế, bộ icon tính năng chi tiết chuẩn vector.</w:t>
       </w:r>
     </w:p>
     <w:p>

</xml_diff>

<commit_message>
feat(cv): add computer assembly, installation and IT support across all profiles and documents
</commit_message>
<xml_diff>
--- a/Ho-So-Ung-Tuyen/CV-Graphic-UIUX-Designer-Le-Tran-Thanh-Uyen.docx
+++ b/Ho-So-Ung-Tuyen/CV-Graphic-UIUX-Designer-Le-Tran-Thanh-Uyen.docx
@@ -224,7 +224,30 @@
           <w:color w:val="1F2937"/>
           <w:sz w:val="22"/>
         </w:rPr>
-        <w:t xml:space="preserve">5. Ứng Dụng Thực Chiến Vào Hệ Thống Web: </w:t>
+        <w:t xml:space="preserve">5. Hạ Tầng Đồ Họa &amp; Máy Trạm Workstation: </w:t>
+      </w:r>
+      <w:r>
+        <w:rPr>
+          <w:rFonts w:ascii="Arial" w:hAnsi="Arial"/>
+          <w:color w:val="1F2937"/>
+          <w:sz w:val="22"/>
+        </w:rPr>
+        <w:t>Tự tay lựa chọn linh kiện và lắp ráp máy trạm Workstation PC đồ họa cấu hình cao phục vụ render và thiết kế mượt mà; cài đặt hệ điều hành và bộ phần mềm Adobe Creative Cloud chuẩn xác; xử lý sự cố phần cứng, phần mềm, mạng nội bộ và cân màu màn hình.</w:t>
+      </w:r>
+    </w:p>
+    <w:p>
+      <w:pPr>
+        <w:pStyle w:val="ListBullet"/>
+        <w:spacing w:before="40" w:after="60" w:line="288" w:lineRule="auto"/>
+      </w:pPr>
+      <w:r>
+        <w:rPr>
+          <w:rFonts w:ascii="Arial" w:hAnsi="Arial"/>
+          <w:b/>
+          <w:color w:val="1F2937"/>
+          <w:sz w:val="22"/>
+        </w:rPr>
+        <w:t xml:space="preserve">6. Ứng Dụng Thực Chiến Vào Hệ Thống Web: </w:t>
       </w:r>
       <w:r>
         <w:rPr>

</xml_diff>

<commit_message>
feat(cv): tailor UI/UX and graphic profiles to fully align with job requirements
</commit_message>
<xml_diff>
--- a/Ho-So-Ung-Tuyen/CV-Graphic-UIUX-Designer-Le-Tran-Thanh-Uyen.docx
+++ b/Ho-So-Ung-Tuyen/CV-Graphic-UIUX-Designer-Le-Tran-Thanh-Uyen.docx
@@ -99,7 +99,7 @@
           <w:color w:val="1F2937"/>
           <w:sz w:val="22"/>
         </w:rPr>
-        <w:t>Chuyên viên Graphic Designer &amp; Web UI/UX Specialist với hơn 3 năm kinh nghiệm thực chiến thành thạo bộ công cụ Adobe Creative Suite (Adobe Photoshop, Adobe Illustrator) kết hợp tư duy thiết kế trải nghiệm người dùng (UI/UX) và kiến thức lập trình giao diện web. Trực tiếp thiết kế bộ nhận diện thương hiệu, hệ thống banner marketing quảng cáo, xử lý retouching hình ảnh thẩm mỹ viện / sản phẩm cao cấp, và xây dựng layout website chuẩn responsive tối ưu chuyển đổi (CRO). Am hiểu sâu sắc kỹ thuật tối ưu đồ họa web (WebP, SVG, nén ảnh chống vỡ layout) giúp sản phẩm số luôn giữ độ sắc nét đỉnh cao cùng tốc độ tải trang dưới 2s.</w:t>
+        <w:t>Chuyên viên Graphic Designer &amp; Web UI/UX Specialist (Tốt nghiệp chuyên ngành CNTT, hơn 3 năm kinh nghiệm thực chiến) thành thạo bộ công cụ Adobe Creative Suite (Photoshop, Illustrator), tư duy thẩm mỹ cao, hiểu sâu hành vi người dùng và có năng lực phát triển trọn vẹn từ ý tưởng đến thành phẩm UX: Storyboard, Wireframe, Sitemaps, Flowcharts, Mockups, Interactive Prototype (Figma) và Design System. Xây dựng giao diện UI gia tăng tính thẩm mỹ cho website, phần mềm, app trên cả 3 nền tảng Desktop, Tablet và Mobile. Sở hữu lợi thế vượt trội về lập trình mã nguồn (HTML5, CSS3, JavaScript), hiểu biết SEO và hiệu năng giao diện; có khả năng làm việc độc lập từ A-Z dựng chạy các hệ thống web phức tạp, phối hợp nhịp nhàng với R&amp;D, Marketing, Development, QA; đồng thời đáp ứng trọn vẹn yêu cầu ưu tiên về cài đặt phần mềm, sửa chữa phần cứng PC/Laptop và quản trị thiết bị IT.</w:t>
       </w:r>
     </w:p>
     <w:p>
@@ -117,7 +117,7 @@
           <w:color w:val="0B2342"/>
           <w:sz w:val="27"/>
         </w:rPr>
-        <w:t>■  KỸ NĂNG THIẾT KẾ CHUYÊN NGHIỆP (5 TRỤ CỘT THỰC CHIẾN)</w:t>
+        <w:t>■  KỸ NĂNG THIẾT KẾ CHUYÊN NGHIỆP (ĐÁP ỨNG TOÀN DIỆN YÊU CẦU TUYỂN DỤNG)</w:t>
       </w:r>
     </w:p>
     <w:p>
@@ -132,7 +132,7 @@
           <w:color w:val="1F2937"/>
           <w:sz w:val="22"/>
         </w:rPr>
-        <w:t xml:space="preserve">1. Adobe Photoshop Chuyên Sâu: </w:t>
+        <w:t xml:space="preserve">1. Thành Phẩm UX &amp; Quy Trình Thiết Kế: </w:t>
       </w:r>
       <w:r>
         <w:rPr>
@@ -140,7 +140,7 @@
           <w:color w:val="1F2937"/>
           <w:sz w:val="22"/>
         </w:rPr>
-        <w:t>Retouching chân dung &amp; thẩm mỹ viện, xử lý ảnh sản phẩm sắc nét (E-commerce), thiết kế Banner quảng cáo Google/Facebook, Poster &amp; Standee sự kiện, phối cảnh Mockups sản phẩm chân thực, Color Grading và ánh sáng nghệ thuật.</w:t>
+        <w:t>Phát triển từ ý tưởng đến Storyboard, Wireframe, Sitemaps, User Flowcharts, Mockups độ nét cao và Interactive Prototype (Figma); xây dựng Design System và Component Library chuyên nghiệp.</w:t>
       </w:r>
     </w:p>
     <w:p>
@@ -155,7 +155,7 @@
           <w:color w:val="1F2937"/>
           <w:sz w:val="22"/>
         </w:rPr>
-        <w:t xml:space="preserve">2. Adobe Illustrator &amp; Vector Design: </w:t>
+        <w:t xml:space="preserve">2. Thiết Kế UI Đa Nền Tảng (Desktop, Mobile, Tablet): </w:t>
       </w:r>
       <w:r>
         <w:rPr>
@@ -163,7 +163,7 @@
           <w:color w:val="1F2937"/>
           <w:sz w:val="22"/>
         </w:rPr>
-        <w:t>Thiết kế Logo &amp; Brand Guidelines, hệ thống Iconography Vector (SVG), Infographic &amp; biểu đồ trực quan, Typography &amp; bố cục chữ nghệ thuật, ấn phẩm in ấn (Namecard, Brochure, Flyer), xuất file in ấn CMYK và Digital RGB chuẩn nét.</w:t>
+        <w:t>Xây dựng giao diện người dùng (UI), gia tăng tính thẩm mỹ cho website, phần mềm, app; thiết kế responsive mượt mà trên Desktop, Tablet và Mobile; tối ưu tỷ lệ chuyển đổi (CRO), khảo sát và phân tích phản hồi khách hàng để liên tục cải tiến sản phẩm.</w:t>
       </w:r>
     </w:p>
     <w:p>
@@ -178,7 +178,7 @@
           <w:color w:val="1F2937"/>
           <w:sz w:val="22"/>
         </w:rPr>
-        <w:t xml:space="preserve">3. Thiết Kế Giao Diện Web UI/UX: </w:t>
+        <w:t xml:space="preserve">3. Adobe Photoshop &amp; Illustrator Chuyên Sâu: </w:t>
       </w:r>
       <w:r>
         <w:rPr>
@@ -186,7 +186,7 @@
           <w:color w:val="1F2937"/>
           <w:sz w:val="22"/>
         </w:rPr>
-        <w:t>Wireframing &amp; Prototype (Figma), bố cục Mobile-First Responsive, thiết kế Landing Page tài chính/thẩm mỹ, tối ưu tỷ lệ chuyển đổi (CRO Lead Form), Design System &amp; bảng màu chuẩn web, Micro-interactions.</w:t>
+        <w:t>Retouching chân dung thẩm mỹ viện, xử lý ảnh sản phẩm sắc nét (E-com), thiết kế Banner/Poster quảng cáo đa kênh, vẽ vector logo thương hiệu, xuất bản file in ấn CMYK và digital RGB chuẩn nét.</w:t>
       </w:r>
     </w:p>
     <w:p>
@@ -201,7 +201,7 @@
           <w:color w:val="1F2937"/>
           <w:sz w:val="22"/>
         </w:rPr>
-        <w:t xml:space="preserve">4. Tối Ưu Đồ Họa Web &amp; Hiệu Năng: </w:t>
+        <w:t xml:space="preserve">4. Lợi Thế Kỹ Thuật (HTML/CSS/JS &amp; SEO): </w:t>
       </w:r>
       <w:r>
         <w:rPr>
@@ -209,7 +209,7 @@
           <w:color w:val="1F2937"/>
           <w:sz w:val="22"/>
         </w:rPr>
-        <w:t>Nén ảnh định dạng WebP chất lượng cao, tối ưu mã nguồn SVG siêu nhẹ, cố định tỷ lệ Aspect Ratio chống CLS, xuất ảnh đa độ phân giải Retina 2x/3x, phối hợp Semantic HTML5 &amp; CSS3 Flexbox/Grid, Core Web Vitals chuẩn xanh.</w:t>
+        <w:t>Thành thạo HTML5 Semantic, CSS3 Flexbox/Grid, JavaScript; am hiểu sâu sắc về SEO On-page và tối ưu Core Web Vitals (LCP &lt; 2s, CLS &lt; 0.1), nén ảnh WebP/SVG siêu nhẹ giúp giao diện đạt tốc độ tải trang cao nhất.</w:t>
       </w:r>
     </w:p>
     <w:p>
@@ -224,7 +224,7 @@
           <w:color w:val="1F2937"/>
           <w:sz w:val="22"/>
         </w:rPr>
-        <w:t xml:space="preserve">5. Hạ Tầng Đồ Họa &amp; Máy Trạm Workstation: </w:t>
+        <w:t xml:space="preserve">5. Độc Lập Triển Khai A-Z &amp; Teamwork Liên Bộ Phận: </w:t>
       </w:r>
       <w:r>
         <w:rPr>
@@ -232,7 +232,7 @@
           <w:color w:val="1F2937"/>
           <w:sz w:val="22"/>
         </w:rPr>
-        <w:t>Tự tay lựa chọn linh kiện và lắp ráp máy trạm Workstation PC đồ họa cấu hình cao phục vụ render và thiết kế mượt mà; cài đặt hệ điều hành và bộ phần mềm Adobe Creative Cloud chuẩn xác; xử lý sự cố phần cứng, phần mềm, mạng nội bộ và cân màu màn hình.</w:t>
+        <w:t>Khả năng làm việc độc lập từ A-Z, tự thiết kế và dựng chạy các hệ thống web từ trung bình đến phức tạp (WooCommerce, Laravel, Blogspot); kỹ năng giao tiếp và phối hợp chặt chẽ cùng các bộ phận R&amp;D, Marketing, Development, QA.</w:t>
       </w:r>
     </w:p>
     <w:p>
@@ -247,7 +247,7 @@
           <w:color w:val="1F2937"/>
           <w:sz w:val="22"/>
         </w:rPr>
-        <w:t xml:space="preserve">6. Ứng Dụng Thực Chiến Vào Hệ Thống Web: </w:t>
+        <w:t xml:space="preserve">6. Hạ Tầng IT, Phần Cứng &amp; Trang Thiết Bị (Ưu Tiên): </w:t>
       </w:r>
       <w:r>
         <w:rPr>
@@ -255,7 +255,7 @@
           <w:color w:val="1F2937"/>
           <w:sz w:val="22"/>
         </w:rPr>
-        <w:t>Thiết kế trọn gói giao diện &amp; banner cho Viện thẩm mỹ WangSun Luxury, xây dựng Landing Page tài chính Tài Chính Tài Thành (taichinhtaithanh.com) tối ưu chuyển đổi CRO, Visual Design cho sàn thương mại điện tử chậu đá Stone Sinks Vietnam, giao diện cổng danh bạ Sàn Thẩm Mỹ (santhammy.com).</w:t>
+        <w:t>Trực tiếp lắp ráp máy trạm Workstation PC đồ họa cấu hình cao; cài đặt hệ điều hành và bộ phần mềm chuyên dụng; chuẩn đoán và sửa chữa sự cố phần cứng, phần mềm PC/Laptop; thiết lập mạng nội bộ LAN/Wi-Fi và quản lý trang thiết bị văn phòng.</w:t>
       </w:r>
     </w:p>
     <w:p>

</xml_diff>

<commit_message>
refactor(cv): remove redundant UX buzzword enumeration across all templates and documents
</commit_message>
<xml_diff>
--- a/Ho-So-Ung-Tuyen/CV-Graphic-UIUX-Designer-Le-Tran-Thanh-Uyen.docx
+++ b/Ho-So-Ung-Tuyen/CV-Graphic-UIUX-Designer-Le-Tran-Thanh-Uyen.docx
@@ -99,7 +99,7 @@
           <w:color w:val="1F2937"/>
           <w:sz w:val="22"/>
         </w:rPr>
-        <w:t>Chuyên viên Graphic Designer &amp; Web UI/UX Specialist (Tốt nghiệp chuyên ngành CNTT, hơn 3 năm kinh nghiệm thực chiến) thành thạo bộ công cụ Adobe Creative Suite (Photoshop, Illustrator), tư duy thẩm mỹ cao, hiểu sâu hành vi người dùng và có năng lực phát triển trọn vẹn từ ý tưởng đến thành phẩm UX: Storyboard, Wireframe, Sitemaps, Flowcharts, Mockups, Interactive Prototype (Figma) và Design System. Xây dựng giao diện UI gia tăng tính thẩm mỹ cho website, phần mềm, app trên cả 3 nền tảng Desktop, Tablet và Mobile. Sở hữu lợi thế vượt trội về lập trình mã nguồn (HTML5, CSS3, JavaScript), hiểu biết SEO và hiệu năng giao diện; có khả năng làm việc độc lập từ A-Z dựng chạy các hệ thống web phức tạp, phối hợp nhịp nhàng với R&amp;D, Marketing, Development, QA; đồng thời đáp ứng trọn vẹn yêu cầu ưu tiên về cài đặt phần mềm, sửa chữa phần cứng PC/Laptop và quản trị thiết bị IT.</w:t>
+        <w:t>Chuyên viên Graphic Designer &amp; Web UI/UX Specialist (Tốt nghiệp chuyên ngành CNTT, hơn 3 năm kinh nghiệm thực chiến) thành thạo bộ công cụ Adobe Creative Suite (Photoshop, Illustrator), tư duy thẩm mỹ tốt, sáng tạo và thấu hiểu hành vi người dùng. Xây dựng giao diện UI trực quan, hiện đại, gia tăng tính thẩm mỹ cho website, phần mềm, app trên cả 3 nền tảng Desktop, Tablet và Mobile. Sở hữu lợi thế vượt trội về lập trình mã nguồn (HTML5, CSS3, JavaScript), hiểu biết SEO và hiệu năng giao diện; có khả năng làm việc độc lập từ A-Z dựng chạy các hệ thống web phức tạp, phối hợp nhịp nhàng với R&amp;D, Marketing, Development, QA; đồng thời đáp ứng trọn vẹn yêu cầu ưu tiên về cài đặt phần mềm, sửa chữa phần cứng PC/Laptop và quản trị thiết bị IT.</w:t>
       </w:r>
     </w:p>
     <w:p>
@@ -132,7 +132,7 @@
           <w:color w:val="1F2937"/>
           <w:sz w:val="22"/>
         </w:rPr>
-        <w:t xml:space="preserve">1. Thành Phẩm UX &amp; Quy Trình Thiết Kế: </w:t>
+        <w:t xml:space="preserve">1. Thiết Kế UI/UX &amp; Giao Diện Số Trực Quan: </w:t>
       </w:r>
       <w:r>
         <w:rPr>
@@ -140,7 +140,7 @@
           <w:color w:val="1F2937"/>
           <w:sz w:val="22"/>
         </w:rPr>
-        <w:t>Phát triển từ ý tưởng đến Storyboard, Wireframe, Sitemaps, User Flowcharts, Mockups độ nét cao và Interactive Prototype (Figma); xây dựng Design System và Component Library chuyên nghiệp.</w:t>
+        <w:t>Xây dựng giao diện người dùng (UI), gia tăng tính thẩm mỹ cho website, phần mềm, app; thiết kế responsive mượt mà trên Desktop, Tablet và Mobile; sử dụng Figma thiết kế bố cục giao diện trực quan.</w:t>
       </w:r>
     </w:p>
     <w:p>
@@ -365,7 +365,7 @@
           <w:color w:val="1F2937"/>
           <w:sz w:val="22"/>
         </w:rPr>
-        <w:t>Xây dựng bố cục wireframe và layout hoàn chỉnh cho website phòng khám và cổng danh bạ, tối ưu trải nghiệm đọc trên mobile và tăng tỷ lệ click gọi tư vấn.</w:t>
+        <w:t>Xây dựng bố cục và layout hoàn chỉnh cho website phòng khám và cổng danh bạ, tối ưu trải nghiệm đọc trên mobile và tăng tỷ lệ click gọi tư vấn.</w:t>
       </w:r>
     </w:p>
     <w:p>

</xml_diff>